<commit_message>
M6a: Implement export-side sentinelization and reply nesting fix
</commit_message>
<xml_diff>
--- a/fixtures/comments-threaded.docx
+++ b/fixtures/comments-threaded.docx
@@ -48,7 +48,7 @@
 
 <file path=word/comments.xml><?xml version="1.0" encoding="utf-8"?>
 <w:comments xmlns:a="http://schemas.openxmlformats.org/drawingml/2006/main" xmlns:pic="http://schemas.openxmlformats.org/drawingml/2006/picture" xmlns:r="http://schemas.openxmlformats.org/officeDocument/2006/relationships" xmlns:w="http://schemas.openxmlformats.org/wordprocessingml/2006/main" xmlns:wp="http://schemas.openxmlformats.org/drawingml/2006/wordprocessingDrawing" xmlns:mc="http://schemas.openxmlformats.org/markup-compatibility/2006" xmlns:a14="http://schemas.microsoft.com/office/drawing/2010/main" xmlns:w14="http://schemas.microsoft.com/office/word/2010/wordml" xmlns:wpc="http://schemas.microsoft.com/office/word/2010/wordprocessingCanvas">
-  <w:comment w:id="0" w:author="Reviewer A" w:initials="" w:date="2026-07-02T10:37:23Z">
+  <w:comment w:id="0" w:author="Reviewer A" w:initials="" w:date="2026-07-02T00:00:00Z">
     <w:p>
       <w:pPr>
         <w:pStyle w:val="CommentText"/>
@@ -64,7 +64,7 @@
       </w:r>
     </w:p>
   </w:comment>
-  <w:comment w:id="1" w:author="Reviewer B" w:initials="" w:date="2026-07-02T10:37:23Z">
+  <w:comment w:id="1" w:author="Reviewer B" w:initials="" w:date="2026-07-02T00:00:00Z">
     <w:p>
       <w:pPr>
         <w:pStyle w:val="CommentText"/>
@@ -80,7 +80,7 @@
       </w:r>
     </w:p>
   </w:comment>
-  <w:comment w:id="2" w:author="Reviewer B" w:initials="" w:date="2026-07-02T10:37:23Z">
+  <w:comment w:id="2" w:author="Reviewer B" w:initials="" w:date="2026-07-02T00:00:00Z">
     <w:p>
       <w:pPr>
         <w:pStyle w:val="CommentText"/>

</xml_diff>